<commit_message>
Add screenshot of the image being pulled on another machine
Co-Authored-By: Claude Opus 5.5 <noreply@anthropic.com>
</commit_message>
<xml_diff>
--- a/DevOps-Lab-3-Documentation.docx
+++ b/DevOps-Lab-3-Documentation.docx
@@ -85,7 +85,7 @@
         </w:rPr>
         <w:t xml:space="preserve">GitHub: </w:t>
       </w:r>
-      <w:hyperlink w:history="1" r:id="rIdky6s-mmcxroxjkkjplbkp">
+      <w:hyperlink w:history="1" r:id="rId_obgqbajrbe7pruah5kqh">
         <w:r>
           <w:rPr>
             <w:rStyle w:val="Hyperlink"/>
@@ -105,7 +105,7 @@
         </w:rPr>
         <w:t xml:space="preserve">Docker Hub: </w:t>
       </w:r>
-      <w:hyperlink w:history="1" r:id="rIdrgrikmul6q_vcpum-8n5w">
+      <w:hyperlink w:history="1" r:id="rIdwvajqr9_w3q3tuluhwcdz">
         <w:r>
           <w:rPr>
             <w:rStyle w:val="Hyperlink"/>
@@ -1290,7 +1290,74 @@
         <w:spacing w:after="100" w:before="240"/>
       </w:pPr>
       <w:r>
-        <w:t xml:space="preserve">20. Scanned the pushed image on Docker Hub and saved the SARIF report and SBOM.</w:t>
+        <w:t xml:space="preserve">20. A friend pulled </w:t>
+      </w:r>
+      <w:r>
+        <w:rPr>
+          <w:rFonts w:ascii="Consolas" w:cs="Consolas" w:eastAsia="Consolas" w:hAnsi="Consolas"/>
+          <w:color w:val="B3261E"/>
+          <w:sz w:val="20"/>
+          <w:szCs w:val="20"/>
+        </w:rPr>
+        <w:t xml:space="preserve">samuelshine/devops-lab-3</w:t>
+      </w:r>
+      <w:r>
+        <w:t xml:space="preserve"> from Docker Hub on their own machine and got the same digest.</w:t>
+      </w:r>
+    </w:p>
+    <w:p>
+      <w:pPr>
+        <w:spacing w:after="200"/>
+        <w:jc w:val="center"/>
+      </w:pPr>
+      <w:r>
+        <w:drawing>
+          <wp:inline distT="0" distB="0" distL="0" distR="0">
+            <wp:extent cx="5734050" cy="4324350"/>
+            <wp:effectExtent t="0" r="0" b="0" l="0"/>
+            <wp:docPr id="1" name="22-friend-pull.jpg" descr="20. A friend pulled `samuelshine/devops-lab-3` from Docker Hub on their own machine and got the same digest." title="Step 20"/>
+            <wp:cNvGraphicFramePr>
+              <a:graphicFrameLocks xmlns:a="http://schemas.openxmlformats.org/drawingml/2006/main" noChangeAspect="1"/>
+            </wp:cNvGraphicFramePr>
+            <a:graphic xmlns:a="http://schemas.openxmlformats.org/drawingml/2006/main">
+              <a:graphicData uri="http://schemas.openxmlformats.org/drawingml/2006/picture">
+                <pic:pic xmlns:pic="http://schemas.openxmlformats.org/drawingml/2006/picture">
+                  <pic:nvPicPr>
+                    <pic:cNvPr id="0" name="" descr=""/>
+                    <pic:cNvPicPr>
+                      <a:picLocks noChangeAspect="1" noChangeArrowheads="1"/>
+                    </pic:cNvPicPr>
+                  </pic:nvPicPr>
+                  <pic:blipFill>
+                    <a:blip r:embed="rId27" cstate="none"/>
+                    <a:srcRect/>
+                    <a:stretch>
+                      <a:fillRect/>
+                    </a:stretch>
+                  </pic:blipFill>
+                  <pic:spPr bwMode="auto">
+                    <a:xfrm>
+                      <a:off x="0" y="0"/>
+                      <a:ext cx="5734050" cy="4324350"/>
+                    </a:xfrm>
+                    <a:prstGeom prst="rect">
+                      <a:avLst/>
+                    </a:prstGeom>
+                  </pic:spPr>
+                </pic:pic>
+              </a:graphicData>
+            </a:graphic>
+          </wp:inline>
+        </w:drawing>
+      </w:r>
+    </w:p>
+    <w:p>
+      <w:pPr>
+        <w:keepNext/>
+        <w:spacing w:after="100" w:before="240"/>
+      </w:pPr>
+      <w:r>
+        <w:t xml:space="preserve">21. Scanned the pushed image on Docker Hub and saved the SARIF report and SBOM.</w:t>
       </w:r>
     </w:p>
     <w:p>
@@ -1303,21 +1370,21 @@
           <wp:inline distT="0" distB="0" distL="0" distR="0">
             <wp:extent cx="5734050" cy="1666875"/>
             <wp:effectExtent t="0" r="0" b="0" l="0"/>
-            <wp:docPr id="1" name="18-scan-remote.png" descr="20. Scanned the pushed image on Docker Hub and saved the SARIF report and SBOM." title="Step 20"/>
-            <wp:cNvGraphicFramePr>
-              <a:graphicFrameLocks xmlns:a="http://schemas.openxmlformats.org/drawingml/2006/main" noChangeAspect="1"/>
-            </wp:cNvGraphicFramePr>
-            <a:graphic xmlns:a="http://schemas.openxmlformats.org/drawingml/2006/main">
-              <a:graphicData uri="http://schemas.openxmlformats.org/drawingml/2006/picture">
-                <pic:pic xmlns:pic="http://schemas.openxmlformats.org/drawingml/2006/picture">
-                  <pic:nvPicPr>
-                    <pic:cNvPr id="0" name="" descr=""/>
-                    <pic:cNvPicPr>
-                      <a:picLocks noChangeAspect="1" noChangeArrowheads="1"/>
-                    </pic:cNvPicPr>
-                  </pic:nvPicPr>
-                  <pic:blipFill>
-                    <a:blip r:embed="rId27" cstate="none"/>
+            <wp:docPr id="1" name="18-scan-remote.png" descr="21. Scanned the pushed image on Docker Hub and saved the SARIF report and SBOM." title="Step 21"/>
+            <wp:cNvGraphicFramePr>
+              <a:graphicFrameLocks xmlns:a="http://schemas.openxmlformats.org/drawingml/2006/main" noChangeAspect="1"/>
+            </wp:cNvGraphicFramePr>
+            <a:graphic xmlns:a="http://schemas.openxmlformats.org/drawingml/2006/main">
+              <a:graphicData uri="http://schemas.openxmlformats.org/drawingml/2006/picture">
+                <pic:pic xmlns:pic="http://schemas.openxmlformats.org/drawingml/2006/picture">
+                  <pic:nvPicPr>
+                    <pic:cNvPr id="0" name="" descr=""/>
+                    <pic:cNvPicPr>
+                      <a:picLocks noChangeAspect="1" noChangeArrowheads="1"/>
+                    </pic:cNvPicPr>
+                  </pic:nvPicPr>
+                  <pic:blipFill>
+                    <a:blip r:embed="rId28" cstate="none"/>
                     <a:srcRect/>
                     <a:stretch>
                       <a:fillRect/>
@@ -1345,7 +1412,7 @@
         <w:spacing w:after="100" w:before="240"/>
       </w:pPr>
       <w:r>
-        <w:t xml:space="preserve">21. Ran a Trivy gate for fixable critical vulnerabilities, which failed on libssl3 in the base image.</w:t>
+        <w:t xml:space="preserve">22. Ran a Trivy gate for fixable critical vulnerabilities, which failed on libssl3 in the base image.</w:t>
       </w:r>
     </w:p>
     <w:p>
@@ -1358,21 +1425,21 @@
           <wp:inline distT="0" distB="0" distL="0" distR="0">
             <wp:extent cx="5734050" cy="1657350"/>
             <wp:effectExtent t="0" r="0" b="0" l="0"/>
-            <wp:docPr id="1" name="19-scan-gate.png" descr="21. Ran a Trivy gate for fixable critical vulnerabilities, which failed on libssl3 in the base image." title="Step 21"/>
-            <wp:cNvGraphicFramePr>
-              <a:graphicFrameLocks xmlns:a="http://schemas.openxmlformats.org/drawingml/2006/main" noChangeAspect="1"/>
-            </wp:cNvGraphicFramePr>
-            <a:graphic xmlns:a="http://schemas.openxmlformats.org/drawingml/2006/main">
-              <a:graphicData uri="http://schemas.openxmlformats.org/drawingml/2006/picture">
-                <pic:pic xmlns:pic="http://schemas.openxmlformats.org/drawingml/2006/picture">
-                  <pic:nvPicPr>
-                    <pic:cNvPr id="0" name="" descr=""/>
-                    <pic:cNvPicPr>
-                      <a:picLocks noChangeAspect="1" noChangeArrowheads="1"/>
-                    </pic:cNvPicPr>
-                  </pic:nvPicPr>
-                  <pic:blipFill>
-                    <a:blip r:embed="rId28" cstate="none"/>
+            <wp:docPr id="1" name="19-scan-gate.png" descr="22. Ran a Trivy gate for fixable critical vulnerabilities, which failed on libssl3 in the base image." title="Step 22"/>
+            <wp:cNvGraphicFramePr>
+              <a:graphicFrameLocks xmlns:a="http://schemas.openxmlformats.org/drawingml/2006/main" noChangeAspect="1"/>
+            </wp:cNvGraphicFramePr>
+            <a:graphic xmlns:a="http://schemas.openxmlformats.org/drawingml/2006/main">
+              <a:graphicData uri="http://schemas.openxmlformats.org/drawingml/2006/picture">
+                <pic:pic xmlns:pic="http://schemas.openxmlformats.org/drawingml/2006/picture">
+                  <pic:nvPicPr>
+                    <pic:cNvPr id="0" name="" descr=""/>
+                    <pic:cNvPicPr>
+                      <a:picLocks noChangeAspect="1" noChangeArrowheads="1"/>
+                    </pic:cNvPicPr>
+                  </pic:nvPicPr>
+                  <pic:blipFill>
+                    <a:blip r:embed="rId29" cstate="none"/>
                     <a:srcRect/>
                     <a:stretch>
                       <a:fillRect/>

</xml_diff>